<commit_message>
Remove timestamp placeholders; add teacher-feedback checklist
The three [TIMESTAMP] markers in 4.2 were still unfilled in the author's
copy and would have been visible to an examiner. The surrounding sentences
describe each sequence precisely enough to stand without them, so the
markers are removed and the insertion points are documented instead. The
sound paragraph gains a short clarifying clause in place of its marker.

Adds Teacher_Feedback_Checklist.md, mapping likely comments on the original
submission to their status in the current version, for use alongside the
supervisor's recorded feedback.

Word count 3,958. Contents page re-measured; 16 pages, no drift.

Co-Authored-By: Claude Opus 5 <noreply@anthropic.com>
Claude-Session: https://claude.ai/code/session_01ApG9VApKEGn6z74hEHopzF
</commit_message>
<xml_diff>
--- a/EE/EE_Revised.docx
+++ b/EE/EE_Revised.docx
@@ -286,7 +286,7 @@
           <w:sz w:val="24"/>
           <w:szCs w:val="24"/>
         </w:rPr>
-        <w:t xml:space="preserve">Word Count: 3,954 words</w:t>
+        <w:t xml:space="preserve">Word Count: 3,958 words</w:t>
       </w:r>
     </w:p>
     <w:p>
@@ -2432,45 +2432,45 @@
           <w:sz w:val="24"/>
           <w:szCs w:val="24"/>
         </w:rPr>
-        <w:t xml:space="preserve"> does not proceed in sequence. It moves associatively, placing periods of injury and difficulty beside periods of achievement so that each appears to explain the other. In the sequence treating the Achilles rupture of April 2013 and the rehabilitation that followed [TIMESTAMP], the recovery footage is set against earlier material so that it reads as confirmation of a disposition already established rather than as a separate event. Barthes (1957/1972) describes myth as the operation by which the contingent and historical is made to appear natural and essential, and this editing pattern performs exactly that operation. An injury is a contingency; placed in this sequence it becomes an occasion on which an essential quality was revealed. The resulting proposition, that the Mamba Mentality is not a method Bryant adopted but the thing he fundamentally is, is one the film asserts through arrangement without ever stating it.</w:t>
-      </w:r>
-    </w:p>
-    <w:p>
-      <w:pPr>
-        <w:spacing w:after="0" w:line="480"/>
-        <w:ind w:firstLine="720"/>
-        <w:jc w:val="both"/>
-      </w:pPr>
-      <w:r>
-        <w:rPr>
-          <w:rFonts w:ascii="Times New Roman" w:cs="Times New Roman" w:eastAsia="Times New Roman" w:hAnsi="Times New Roman"/>
-          <w:b w:val="false"/>
-          <w:bCs w:val="false"/>
-          <w:i w:val="false"/>
-          <w:iCs w:val="false"/>
-          <w:sz w:val="24"/>
-          <w:szCs w:val="24"/>
-        </w:rPr>
-        <w:t xml:space="preserve">Cinematography contributes a second layer. The rehabilitation material is shot in monochrome and in a visual register quite distinct from the archival game footage, which arrives in the colour and texture of broadcast television [TIMESTAMP]; Lowry (2015) notes the same contrast. Two orders of image are thereby established: the public, collective, televised past, and a present that is private, isolated and composed. Placing the second in the position of interpretive authority over the first implies that the televised career was the surface and the solitary labour was the reality. The viewer is offered access to a privileged interior, which is itself a construction, lit and framed.</w:t>
-      </w:r>
-    </w:p>
-    <w:p>
-      <w:pPr>
-        <w:spacing w:after="0" w:line="480"/>
-        <w:ind w:firstLine="720"/>
-        <w:jc w:val="both"/>
-      </w:pPr>
-      <w:r>
-        <w:rPr>
-          <w:rFonts w:ascii="Times New Roman" w:cs="Times New Roman" w:eastAsia="Times New Roman" w:hAnsi="Times New Roman"/>
-          <w:b w:val="false"/>
-          <w:bCs w:val="false"/>
-          <w:i w:val="false"/>
-          <w:iCs w:val="false"/>
-          <w:sz w:val="24"/>
-          <w:szCs w:val="24"/>
-        </w:rPr>
-        <w:t xml:space="preserve">Sound completes the effect. Kris Bowers’s original score accompanies the film’s turning points [TIMESTAMP]. Chion (1994) uses the term </w:t>
+        <w:t xml:space="preserve"> does not proceed in sequence. It moves associatively, placing periods of injury and difficulty beside periods of achievement so that each appears to explain the other. In the sequence treating the Achilles rupture of April 2013 and the rehabilitation that followed, the recovery footage is set against earlier material so that it reads as confirmation of a disposition already established rather than as a separate event. Barthes (1957/1972) describes myth as the operation by which the contingent and historical is made to appear natural and essential, and this editing pattern performs exactly that operation. An injury is a contingency; placed in this sequence it becomes an occasion on which an essential quality was revealed. The resulting proposition, that the Mamba Mentality is not a method Bryant adopted but the thing he fundamentally is, is one the film asserts through arrangement without ever stating it.</w:t>
+      </w:r>
+    </w:p>
+    <w:p>
+      <w:pPr>
+        <w:spacing w:after="0" w:line="480"/>
+        <w:ind w:firstLine="720"/>
+        <w:jc w:val="both"/>
+      </w:pPr>
+      <w:r>
+        <w:rPr>
+          <w:rFonts w:ascii="Times New Roman" w:cs="Times New Roman" w:eastAsia="Times New Roman" w:hAnsi="Times New Roman"/>
+          <w:b w:val="false"/>
+          <w:bCs w:val="false"/>
+          <w:i w:val="false"/>
+          <w:iCs w:val="false"/>
+          <w:sz w:val="24"/>
+          <w:szCs w:val="24"/>
+        </w:rPr>
+        <w:t xml:space="preserve">Cinematography contributes a second layer. The rehabilitation material is shot in monochrome and in a visual register quite distinct from the archival game footage, which arrives in the colour and texture of broadcast television; Lowry (2015) notes the same contrast. Two orders of image are thereby established: the public, collective, televised past, and a present that is private, isolated and composed. Placing the second in the position of interpretive authority over the first implies that the televised career was the surface and the solitary labour was the reality. The viewer is offered access to a privileged interior, which is itself a construction, lit and framed.</w:t>
+      </w:r>
+    </w:p>
+    <w:p>
+      <w:pPr>
+        <w:spacing w:after="0" w:line="480"/>
+        <w:ind w:firstLine="720"/>
+        <w:jc w:val="both"/>
+      </w:pPr>
+      <w:r>
+        <w:rPr>
+          <w:rFonts w:ascii="Times New Roman" w:cs="Times New Roman" w:eastAsia="Times New Roman" w:hAnsi="Times New Roman"/>
+          <w:b w:val="false"/>
+          <w:bCs w:val="false"/>
+          <w:i w:val="false"/>
+          <w:iCs w:val="false"/>
+          <w:sz w:val="24"/>
+          <w:szCs w:val="24"/>
+        </w:rPr>
+        <w:t xml:space="preserve">Sound completes the effect. Kris Bowers’s original score accompanies the film’s turning points rather than its passages of game action. Chion (1994) uses the term </w:t>
       </w:r>
       <w:r>
         <w:rPr>

</xml_diff>